<commit_message>
Freebuff: Samee template docx file 100% waafaqsan sawirka scan
</commit_message>
<xml_diff>
--- a/public/templates/cadayn_cilaaj/cilaaj.docx
+++ b/public/templates/cadayn_cilaaj/cilaaj.docx
@@ -2,6 +2,243 @@
 <file path=word/document.xml><?xml version="1.0" encoding="utf-8"?>
 <w:document xmlns:wpc="http://schemas.microsoft.com/office/word/2010/wordprocessingCanvas" xmlns:mc="http://schemas.openxmlformats.org/markup-compatibility/2006" xmlns:o="urn:schemas-microsoft-com:office:office" xmlns:r="http://schemas.openxmlformats.org/officeDocument/2006/relationships" xmlns:m="http://schemas.openxmlformats.org/officeDocument/2006/math" xmlns:v="urn:schemas-microsoft-com:vml" xmlns:wp14="http://schemas.microsoft.com/office/word/2010/wordprocessingDrawing" xmlns:wp="http://schemas.openxmlformats.org/drawingml/2006/wordprocessingDrawing" xmlns:w10="urn:schemas-microsoft-com:office:word" xmlns:w="http://schemas.openxmlformats.org/wordprocessingml/2006/main" xmlns:w14="http://schemas.microsoft.com/office/word/2010/wordml" xmlns:w15="http://schemas.microsoft.com/office/word/2012/wordml" xmlns:wpg="http://schemas.microsoft.com/office/word/2010/wordprocessingGroup" xmlns:wpi="http://schemas.microsoft.com/office/word/2010/wordprocessingInk" xmlns:wne="http://schemas.microsoft.com/office/word/2006/wordml" xmlns:wps="http://schemas.microsoft.com/office/word/2010/wordprocessingShape" xmlns:cx="http://schemas.microsoft.com/office/drawing/2014/chartex" xmlns:cx1="http://schemas.microsoft.com/office/drawing/2015/9/8/chartex" xmlns:cx2="http://schemas.microsoft.com/office/drawing/2015/10/21/chartex" xmlns:cx3="http://schemas.microsoft.com/office/drawing/2016/5/9/chartex" xmlns:cx4="http://schemas.microsoft.com/office/drawing/2016/5/10/chartex" xmlns:cx5="http://schemas.microsoft.com/office/drawing/2016/5/11/chartex" xmlns:cx6="http://schemas.microsoft.com/office/drawing/2016/5/12/chartex" xmlns:cx7="http://schemas.microsoft.com/office/drawing/2016/5/13/chartex" xmlns:cx8="http://schemas.microsoft.com/office/drawing/2016/5/14/chartex" xmlns:aink="http://schemas.microsoft.com/office/drawing/2016/ink" xmlns:am3d="http://schemas.microsoft.com/office/drawing/2017/model3d" xmlns:w16cex="http://schemas.microsoft.com/office/word/2018/wordml/cex" xmlns:w16cid="http://schemas.microsoft.com/office/word/2016/wordml/cid" xmlns:w16="http://schemas.microsoft.com/office/word/2018/wordml" xmlns:w16sdtdh="http://schemas.microsoft.com/office/word/2020/wordml/sdtdatahash" xmlns:w16se="http://schemas.microsoft.com/office/word/2015/wordml/symex" mc:Ignorable="w14 w15 wp14">
   <w:body>
+    <w:tbl>
+      <w:tblPr>
+        <w:tblW w:type="pct" w:w="5000"/>
+        <w:tblBorders>
+          <w:top w:val="none" w:color="auto" w:sz="0"/>
+          <w:left w:val="none" w:color="auto" w:sz="0"/>
+          <w:bottom w:val="none" w:color="auto" w:sz="0"/>
+          <w:right w:val="none" w:color="auto" w:sz="0"/>
+          <w:insideH w:val="none" w:color="auto" w:sz="0"/>
+          <w:insideV w:val="none" w:color="auto" w:sz="0"/>
+        </w:tblBorders>
+      </w:tblPr>
+      <w:tblGrid>
+        <w:gridCol w:w="3181"/>
+        <w:gridCol w:w="6457"/>
+        <w:gridCol w:w="3277"/>
+      </w:tblGrid>
+      <w:tr>
+        <w:tc>
+          <w:tcPr>
+            <w:tcW w:type="pct" w:w="1650"/>
+            <w:tcBorders>
+              <w:top w:val="none" w:color="auto" w:sz="0"/>
+              <w:left w:val="none" w:color="auto" w:sz="0"/>
+              <w:bottom w:val="none" w:color="auto" w:sz="0"/>
+              <w:right w:val="none" w:color="auto" w:sz="0"/>
+            </w:tcBorders>
+            <w:tcMar>
+              <w:top w:type="dxa" w:w="0"/>
+              <w:left w:type="dxa" w:w="0"/>
+              <w:bottom w:type="dxa" w:w="0"/>
+              <w:right w:type="dxa" w:w="0"/>
+            </w:tcMar>
+          </w:tcPr>
+          <w:p>
+            <w:pPr>
+              <w:spacing w:after="40"/>
+              <w:jc w:val="left"/>
+            </w:pPr>
+            <w:r>
+              <w:rPr>
+                <w:b/>
+                <w:bCs/>
+                <w:sz w:val="24"/>
+                <w:szCs w:val="24"/>
+              </w:rPr>
+              <w:t xml:space="preserve">JAMHUURIYADDA SOMALILAND</w:t>
+            </w:r>
+          </w:p>
+        </w:tc>
+        <w:tc>
+          <w:tcPr>
+            <w:tcW w:type="pct" w:w="3350"/>
+            <w:tcBorders>
+              <w:top w:val="none" w:color="auto" w:sz="0"/>
+              <w:left w:val="none" w:color="auto" w:sz="0"/>
+              <w:bottom w:val="none" w:color="auto" w:sz="0"/>
+              <w:right w:val="none" w:color="auto" w:sz="0"/>
+            </w:tcBorders>
+            <w:tcMar>
+              <w:top w:type="dxa" w:w="0"/>
+              <w:left w:type="dxa" w:w="0"/>
+              <w:bottom w:type="dxa" w:w="0"/>
+              <w:right w:type="dxa" w:w="0"/>
+            </w:tcMar>
+          </w:tcPr>
+          <w:p>
+            <w:pPr>
+              <w:spacing w:after="40"/>
+              <w:jc w:val="right"/>
+            </w:pPr>
+            <w:r>
+              <w:rPr>
+                <w:b/>
+                <w:bCs/>
+                <w:sz w:val="24"/>
+                <w:szCs w:val="24"/>
+              </w:rPr>
+              <w:t xml:space="preserve">REPUBLIC OF SOMALILAND</w:t>
+            </w:r>
+          </w:p>
+        </w:tc>
+      </w:tr>
+      <w:tr>
+        <w:tc>
+          <w:tcPr>
+            <w:tcW w:type="pct" w:w="1650"/>
+            <w:tcBorders>
+              <w:top w:val="none" w:color="auto" w:sz="0"/>
+              <w:left w:val="none" w:color="auto" w:sz="0"/>
+              <w:bottom w:val="none" w:color="auto" w:sz="0"/>
+              <w:right w:val="none" w:color="auto" w:sz="0"/>
+            </w:tcBorders>
+            <w:tcMar>
+              <w:top w:type="dxa" w:w="0"/>
+              <w:left w:type="dxa" w:w="0"/>
+              <w:bottom w:type="dxa" w:w="0"/>
+              <w:right w:type="dxa" w:w="0"/>
+            </w:tcMar>
+          </w:tcPr>
+          <w:p>
+            <w:pPr>
+              <w:spacing w:after="40"/>
+              <w:jc w:val="left"/>
+            </w:pPr>
+            <w:r>
+              <w:rPr>
+                <w:b/>
+                <w:bCs/>
+                <w:sz w:val="22"/>
+                <w:szCs w:val="22"/>
+              </w:rPr>
+              <w:t xml:space="preserve">WASAARADDA CADAALADDA</w:t>
+            </w:r>
+          </w:p>
+        </w:tc>
+        <w:tc>
+          <w:tcPr>
+            <w:tcW w:type="pct" w:w="1650"/>
+            <w:tcBorders>
+              <w:top w:val="none" w:color="auto" w:sz="0"/>
+              <w:left w:val="none" w:color="auto" w:sz="0"/>
+              <w:bottom w:val="none" w:color="auto" w:sz="0"/>
+              <w:right w:val="none" w:color="auto" w:sz="0"/>
+            </w:tcBorders>
+            <w:tcMar>
+              <w:top w:type="dxa" w:w="0"/>
+              <w:left w:type="dxa" w:w="0"/>
+              <w:bottom w:type="dxa" w:w="0"/>
+              <w:right w:type="dxa" w:w="0"/>
+            </w:tcMar>
+          </w:tcPr>
+          <w:p>
+            <w:pPr>
+              <w:spacing w:after="40"/>
+              <w:jc w:val="center"/>
+            </w:pPr>
+            <w:r>
+              <w:rPr>
+                <w:sz w:val="18"/>
+                <w:szCs w:val="18"/>
+              </w:rPr>
+              <w:t xml:space="preserve">وزارة العدل</w:t>
+            </w:r>
+          </w:p>
+        </w:tc>
+        <w:tc>
+          <w:tcPr>
+            <w:tcW w:type="pct" w:w="1700"/>
+            <w:tcBorders>
+              <w:top w:val="none" w:color="auto" w:sz="0"/>
+              <w:left w:val="none" w:color="auto" w:sz="0"/>
+              <w:bottom w:val="none" w:color="auto" w:sz="0"/>
+              <w:right w:val="none" w:color="auto" w:sz="0"/>
+            </w:tcBorders>
+            <w:tcMar>
+              <w:top w:type="dxa" w:w="0"/>
+              <w:left w:type="dxa" w:w="0"/>
+              <w:bottom w:type="dxa" w:w="0"/>
+              <w:right w:type="dxa" w:w="0"/>
+            </w:tcMar>
+          </w:tcPr>
+          <w:p>
+            <w:pPr>
+              <w:spacing w:after="40"/>
+              <w:jc w:val="right"/>
+            </w:pPr>
+            <w:r>
+              <w:rPr>
+                <w:b/>
+                <w:bCs/>
+                <w:sz w:val="22"/>
+                <w:szCs w:val="22"/>
+              </w:rPr>
+              <w:t xml:space="preserve">MINISTRY OF JUSTICE</w:t>
+            </w:r>
+          </w:p>
+        </w:tc>
+      </w:tr>
+    </w:tbl>
+    <w:p>
+      <w:pPr>
+        <w:spacing w:after="20" w:before="80"/>
+        <w:jc w:val="center"/>
+      </w:pPr>
+      <w:r>
+        <w:rPr>
+          <w:b/>
+          <w:bCs/>
+          <w:color w:val="1F4E79"/>
+          <w:sz w:val="36"/>
+          <w:szCs w:val="36"/>
+        </w:rPr>
+        <w:t xml:space="preserve">DALOODHO PUBLIC NOTARY OFFICE</w:t>
+      </w:r>
+    </w:p>
+    <w:p>
+      <w:pPr>
+        <w:spacing w:after="80"/>
+        <w:jc w:val="center"/>
+      </w:pPr>
+      <w:r>
+        <w:rPr>
+          <w:sz w:val="22"/>
+          <w:szCs w:val="22"/>
+        </w:rPr>
+        <w:t xml:space="preserve">Xafiiska Nootaayada Sharciga Ah ee Daloodho</w:t>
+      </w:r>
+    </w:p>
+    <w:p>
+      <w:pPr>
+        <w:spacing w:after="60"/>
+        <w:jc w:val="center"/>
+      </w:pPr>
+      <w:r>
+        <w:rPr>
+          <w:color w:val="1F7A33"/>
+          <w:sz w:val="18"/>
+          <w:szCs w:val="18"/>
+        </w:rPr>
+        <w:t xml:space="preserve">Location Hargeisa Somaliland , 26 June District near 26 June Police Station</w:t>
+      </w:r>
+    </w:p>
+    <w:p>
+      <w:pPr>
+        <w:spacing w:after="200"/>
+        <w:jc w:val="center"/>
+      </w:pPr>
+      <w:r>
+        <w:rPr>
+          <w:color w:val="9C2A2A"/>
+          <w:sz w:val="18"/>
+          <w:szCs w:val="18"/>
+        </w:rPr>
+        <w:t xml:space="preserve">Email: Daloodhopublic441@gmail.com   Tell:+252-63-4410449/ +252-63-4115487</w:t>
+      </w:r>
+    </w:p>
     <w:p>
       <w:pPr>
         <w:tabs>
@@ -89,87 +326,87 @@
         <w:spacing w:after="120" w:line="300"/>
       </w:pPr>
       <w:r>
-        <w:t xml:space="preserve">1.In aan masuul buuxa ka ahay bukaanka Magaciisu yahay {{BUKAANKA_MAGAC}}</w:t>
-      </w:r>
-    </w:p>
-    <w:p>
-      <w:pPr>
-        <w:spacing w:after="120" w:line="300"/>
-      </w:pPr>
-      <w:r>
-        <w:t xml:space="preserve">2.In Bukaankan Da'diisu Tahay {{BUKAANKA_DAADI}} Jir.</w:t>
-      </w:r>
-    </w:p>
-    <w:p>
-      <w:pPr>
-        <w:spacing w:after="120" w:line="300"/>
-      </w:pPr>
-      <w:r>
-        <w:t xml:space="preserve">3.In aanay jirin Wax Hanti ah oo uu Gaar u leeyahay Iyo Dhadhaxaltoona.</w:t>
-      </w:r>
-    </w:p>
-    <w:p>
-      <w:pPr>
-        <w:spacing w:after="120" w:line="300"/>
-      </w:pPr>
-      <w:r>
-        <w:t xml:space="preserve">4.In Xiddhiidhka naga dhexeeya Ee Eehnimoyahaya Iyo Eehlhinimo yahay ({{XIRIIRKA}}).</w:t>
-      </w:r>
-    </w:p>
-    <w:p>
-      <w:pPr>
-        <w:spacing w:after="120" w:line="300"/>
-      </w:pPr>
-      <w:r>
-        <w:t xml:space="preserve">5.Sidoo Kalena aanay Jirin ama aanan Ku Ogayn Wax Xanuun ah Oo u Weheliya Xanuunka Dhibirka.</w:t>
-      </w:r>
-    </w:p>
-    <w:p>
-      <w:pPr>
-        <w:spacing w:after="120" w:line="300"/>
-      </w:pPr>
-      <w:r>
-        <w:t xml:space="preserve">6.In aniga la ii raaci doono masuulna aan ka ahay wixii dhib ah ee uu bukaankani geysto mudada uu xarunta ku xidhanyahay.</w:t>
-      </w:r>
-    </w:p>
-    <w:p>
-      <w:pPr>
-        <w:spacing w:after="120" w:line="300"/>
-      </w:pPr>
-      <w:r>
-        <w:t xml:space="preserve">7.Inaan u hogaansamayo shuruucda Hospitalka u taala, sida booqashada, daawada, shaybaadhka iyo IWM.</w:t>
-      </w:r>
-    </w:p>
-    <w:p>
-      <w:pPr>
-        <w:spacing w:after="120" w:line="300"/>
-      </w:pPr>
-      <w:r>
-        <w:t xml:space="preserve">8.Inaan raali ka ahay talaabo kasta oo macquula ah oo bukaankan lagula tacaalayo, hadii ay lagama maarmaan noqotana maamulka xaruntu awood buuxda u leeyihiin inay gaar u xidhaan si ay isaga iyo dadka kaleba u badbaadiyaan.</w:t>
-      </w:r>
-    </w:p>
-    <w:p>
-      <w:pPr>
-        <w:spacing w:after="120" w:line="300"/>
-      </w:pPr>
-      <w:r>
-        <w:t xml:space="preserve">9.Inaan bil walba ugu danbayn bixinayo bihsa 5'teeda khidmaca Hospitalka lagu xanaanaynayo bukaanka.</w:t>
-      </w:r>
-    </w:p>
-    <w:p>
-      <w:pPr>
-        <w:spacing w:after="120" w:line="300"/>
-      </w:pPr>
-      <w:r>
-        <w:t xml:space="preserve">10.In waqti kasta oo uu ii baahdo Hospitalku ama xaalad degdeg ahi timaado si dhakhso ah u ajiibi doono.</w:t>
-      </w:r>
-    </w:p>
-    <w:p>
-      <w:pPr>
-        <w:spacing w:after="120" w:line="300"/>
-      </w:pPr>
-      <w:r>
-        <w:t xml:space="preserve">11.Hadii ay dhacdo in bukahu Nafftiisa dhib u geysto ama qadar kale ku yimaado Hospitalka waxba loogama raacayo.</w:t>
+        <w:t xml:space="preserve">1. In aan masuul buuxa ka ahay bukaanka Magaciisu yahay {{BUKAANKA_MAGAC}}</w:t>
+      </w:r>
+    </w:p>
+    <w:p>
+      <w:pPr>
+        <w:spacing w:after="120" w:line="300"/>
+      </w:pPr>
+      <w:r>
+        <w:t xml:space="preserve">2. In Bukaankan Da'diisu Tahay {{BUKAANKA_DAADI}} Jir.</w:t>
+      </w:r>
+    </w:p>
+    <w:p>
+      <w:pPr>
+        <w:spacing w:after="120" w:line="300"/>
+      </w:pPr>
+      <w:r>
+        <w:t xml:space="preserve">3. In aanay jirin Wax Hanti ah oo uu Gaar u leeyahay Iyo Dhaxal toona.</w:t>
+      </w:r>
+    </w:p>
+    <w:p>
+      <w:pPr>
+        <w:spacing w:after="120" w:line="300"/>
+      </w:pPr>
+      <w:r>
+        <w:t xml:space="preserve">4. In Xidhiidhka naga dhexeeya Ee Ehelnimo yahay ({{XIRIIRKA}}).</w:t>
+      </w:r>
+    </w:p>
+    <w:p>
+      <w:pPr>
+        <w:spacing w:after="120" w:line="300"/>
+      </w:pPr>
+      <w:r>
+        <w:t xml:space="preserve">5. Sidoo Kalena aanay Jirin ama aanan Ku Ogayn Wax Xanuun ah Oo u Weheliya Xanuunka Dhibirka.</w:t>
+      </w:r>
+    </w:p>
+    <w:p>
+      <w:pPr>
+        <w:spacing w:after="120" w:line="300"/>
+      </w:pPr>
+      <w:r>
+        <w:t xml:space="preserve">6. In aniga la ii raaci doono masuulna aan ka ahay wixii dhib ah ee uu bukaankani geysto mudada uu xarunta ku xidhanyahay.</w:t>
+      </w:r>
+    </w:p>
+    <w:p>
+      <w:pPr>
+        <w:spacing w:after="120" w:line="300"/>
+      </w:pPr>
+      <w:r>
+        <w:t xml:space="preserve">7. Inaan u hogaansamayo shuruucda Hospitalka u taala, sida booqashada, daawada, shaybaadhka iyo IWM.</w:t>
+      </w:r>
+    </w:p>
+    <w:p>
+      <w:pPr>
+        <w:spacing w:after="120" w:line="300"/>
+      </w:pPr>
+      <w:r>
+        <w:t xml:space="preserve">8. Inaan raali ka ahay talaabo kasta oo macquula ah oo bukaankan lagula tacaalayo, hadii ay lagama maarmaan noqotana maamulka xaruntu awood buuxda u leeyihiin inay gaar u xidhaan si ay isaga iyo dadka kaleba u badbaadiyaan.</w:t>
+      </w:r>
+    </w:p>
+    <w:p>
+      <w:pPr>
+        <w:spacing w:after="120" w:line="300"/>
+      </w:pPr>
+      <w:r>
+        <w:t xml:space="preserve">9. Inaan bil walba ugu danbayn bixinayo bihsa 5'teeda khidmaca Hospitalka lagu xanaanaynayo bukaanka.</w:t>
+      </w:r>
+    </w:p>
+    <w:p>
+      <w:pPr>
+        <w:spacing w:after="120" w:line="300"/>
+      </w:pPr>
+      <w:r>
+        <w:t xml:space="preserve">10. In waqti kasta oo uu ii baahdo Hospitalku ama xaalad degdeg ahi timaado si dhakhso ah u ajiibi doono.</w:t>
+      </w:r>
+    </w:p>
+    <w:p>
+      <w:pPr>
+        <w:spacing w:after="120" w:line="300"/>
+      </w:pPr>
+      <w:r>
+        <w:t xml:space="preserve">11. Hadii ay dhacdo in bukahu Nafftiisa dhib u geysto ama qadar kale ku yimaado Hospitalka waxba loogama raacayo.</w:t>
       </w:r>
     </w:p>
     <w:p>
@@ -186,26 +423,81 @@
         <w:t xml:space="preserve">Saxeexa Masuulka Bukaanka</w:t>
       </w:r>
     </w:p>
-    <w:p>
-      <w:pPr>
-        <w:spacing w:after="120" w:line="300"/>
-      </w:pPr>
-      <w:r>
-        <w:rPr>
-          <w:b/>
-          <w:bCs/>
-        </w:rPr>
-        <w:t xml:space="preserve">1.  {{MASUULKA_MAGAC}}</w:t>
-      </w:r>
-    </w:p>
-    <w:p>
-      <w:pPr>
-        <w:spacing w:after="120" w:line="300"/>
-      </w:pPr>
-      <w:r>
-        <w:t xml:space="preserve">Tell: {{MASUULKA_TELEFOON}}</w:t>
-      </w:r>
-    </w:p>
+    <w:tbl>
+      <w:tblPr>
+        <w:tblW w:type="pct" w:w="5000"/>
+        <w:tblBorders>
+          <w:top w:val="none" w:color="auto" w:sz="0"/>
+          <w:left w:val="none" w:color="auto" w:sz="0"/>
+          <w:bottom w:val="none" w:color="auto" w:sz="0"/>
+          <w:right w:val="none" w:color="auto" w:sz="0"/>
+          <w:insideH w:val="none" w:color="auto" w:sz="0"/>
+          <w:insideV w:val="none" w:color="auto" w:sz="0"/>
+        </w:tblBorders>
+      </w:tblPr>
+      <w:tblGrid>
+        <w:gridCol w:w="5301"/>
+        <w:gridCol w:w="4337"/>
+      </w:tblGrid>
+      <w:tr>
+        <w:tc>
+          <w:tcPr>
+            <w:tcW w:type="pct" w:w="2750"/>
+            <w:tcBorders>
+              <w:top w:val="none" w:color="auto" w:sz="0"/>
+              <w:left w:val="none" w:color="auto" w:sz="0"/>
+              <w:bottom w:val="none" w:color="auto" w:sz="0"/>
+              <w:right w:val="none" w:color="auto" w:sz="0"/>
+            </w:tcBorders>
+            <w:tcMar>
+              <w:top w:type="dxa" w:w="0"/>
+              <w:left w:type="dxa" w:w="0"/>
+              <w:bottom w:type="dxa" w:w="0"/>
+              <w:right w:type="dxa" w:w="0"/>
+            </w:tcMar>
+          </w:tcPr>
+          <w:p>
+            <w:pPr>
+              <w:spacing w:after="40"/>
+              <w:jc w:val="left"/>
+            </w:pPr>
+            <w:r>
+              <w:rPr>
+                <w:b/>
+                <w:bCs/>
+              </w:rPr>
+              <w:t xml:space="preserve">1. {{MASUULKA_MAGAC}}</w:t>
+            </w:r>
+          </w:p>
+        </w:tc>
+        <w:tc>
+          <w:tcPr>
+            <w:tcW w:type="pct" w:w="2250"/>
+            <w:tcBorders>
+              <w:top w:val="none" w:color="auto" w:sz="0"/>
+              <w:left w:val="none" w:color="auto" w:sz="0"/>
+              <w:bottom w:val="none" w:color="auto" w:sz="0"/>
+              <w:right w:val="none" w:color="auto" w:sz="0"/>
+            </w:tcBorders>
+            <w:tcMar>
+              <w:top w:type="dxa" w:w="0"/>
+              <w:left w:type="dxa" w:w="0"/>
+              <w:bottom w:type="dxa" w:w="0"/>
+              <w:right w:type="dxa" w:w="0"/>
+            </w:tcMar>
+          </w:tcPr>
+          <w:p>
+            <w:pPr>
+              <w:spacing w:after="40"/>
+              <w:jc w:val="left"/>
+            </w:pPr>
+            <w:r>
+              <w:t xml:space="preserve">Tell:{{MASUULKA_TELEFOON}}</w:t>
+            </w:r>
+          </w:p>
+        </w:tc>
+      </w:tr>
+    </w:tbl>
     <w:p>
       <w:pPr>
         <w:spacing w:after="120" w:before="200"/>
@@ -233,9 +525,13 @@
         <w:tabs>
           <w:tab w:val="right" w:pos="9026"/>
         </w:tabs>
-        <w:spacing w:after="60"/>
-      </w:pPr>
-      <w:r>
+        <w:spacing w:after="120" w:line="300"/>
+      </w:pPr>
+      <w:r>
+        <w:rPr>
+          <w:b w:val="false"/>
+          <w:bCs w:val="false"/>
+        </w:rPr>
         <w:t xml:space="preserve">{{NUMBER}}. {{MAGAC}}</w:t>
       </w:r>
       <w:r>
@@ -258,7 +554,7 @@
         <w:spacing w:after="120" w:line="300"/>
       </w:pPr>
       <w:r>
-        <w:t xml:space="preserve">Cadaynta Xafiiska : - Xafiisku waxa uu qirayaa in cadayntani u dhacday sifo sharciga waafaqsan laguna hor saxeexay laguna camal fali doono.</w:t>
+        <w:t xml:space="preserve">CadayntaXafiiska : - Xafiisku waxa uu qirayaa in cadayntani u dhacday sifo sharciga waafaqsan laguna hor saxeexay laguna camal fali doono.</w:t>
       </w:r>
     </w:p>
     <w:p>
@@ -289,7 +585,6 @@
       </w:r>
     </w:p>
     <w:sectPr>
-      <w:footerReference w:type="default" r:id="rId6"/>
       <w:pgSz w:w="11906" w:h="16838" w:orient="portrait"/>
       <w:pgMar w:top="1134" w:right="1134" w:bottom="1134" w:left="1134" w:header="708" w:footer="708" w:gutter="0"/>
       <w:pgNumType/>
@@ -334,31 +629,6 @@
     </w:p>
   </w:endnote>
 </w:endnotes>
-</file>
-
-<file path=word/footer1.xml><?xml version="1.0" encoding="utf-8"?>
-<w:ftr xmlns:wpc="http://schemas.microsoft.com/office/word/2010/wordprocessingCanvas" xmlns:mc="http://schemas.openxmlformats.org/markup-compatibility/2006" xmlns:o="urn:schemas-microsoft-com:office:office" xmlns:r="http://schemas.openxmlformats.org/officeDocument/2006/relationships" xmlns:m="http://schemas.openxmlformats.org/officeDocument/2006/math" xmlns:v="urn:schemas-microsoft-com:vml" xmlns:wp14="http://schemas.microsoft.com/office/word/2010/wordprocessingDrawing" xmlns:wp="http://schemas.openxmlformats.org/drawingml/2006/wordprocessingDrawing" xmlns:w10="urn:schemas-microsoft-com:office:word" xmlns:w="http://schemas.openxmlformats.org/wordprocessingml/2006/main" xmlns:w14="http://schemas.microsoft.com/office/word/2010/wordml" xmlns:w15="http://schemas.microsoft.com/office/word/2012/wordml" xmlns:wpg="http://schemas.microsoft.com/office/word/2010/wordprocessingGroup" xmlns:wpi="http://schemas.microsoft.com/office/word/2010/wordprocessingInk" xmlns:wne="http://schemas.microsoft.com/office/word/2006/wordml" xmlns:wps="http://schemas.microsoft.com/office/word/2010/wordprocessingShape">
-  <w:p>
-    <w:pPr>
-      <w:jc w:val="center"/>
-    </w:pPr>
-    <w:r>
-      <w:t xml:space="preserve">Cadayn Cilaaj (Qoraal Hubanti Ah Oo Sugan)  </w:t>
-    </w:r>
-    <w:r>
-      <w:t xml:space="preserve">{{REF_NUMBER}}</w:t>
-    </w:r>
-    <w:r>
-      <w:t xml:space="preserve">  Page </w:t>
-    </w:r>
-    <w:r>
-      <w:fldChar w:fldCharType="begin"/>
-      <w:instrText xml:space="preserve">PAGE</w:instrText>
-      <w:fldChar w:fldCharType="separate"/>
-      <w:fldChar w:fldCharType="end"/>
-    </w:r>
-  </w:p>
-</w:ftr>
 </file>
 
 <file path=word/footnotes.xml><?xml version="1.0" encoding="utf-8"?>

</xml_diff>

<commit_message>
Freebuff: Maxaa ka dhiman system
</commit_message>
<xml_diff>
--- a/public/templates/cadayn_cilaaj/cilaaj.docx
+++ b/public/templates/cadayn_cilaaj/cilaaj.docx
@@ -17,7 +17,7 @@
       <w:tblGrid>
         <w:gridCol w:w="3181"/>
         <w:gridCol w:w="6457"/>
-        <w:gridCol w:w="3277"/>
+        <w:gridCol w:w="2602"/>
       </w:tblGrid>
       <w:tr>
         <w:tc>
@@ -150,7 +150,7 @@
         </w:tc>
         <w:tc>
           <w:tcPr>
-            <w:tcW w:type="pct" w:w="1700"/>
+            <w:tcW w:type="pct" w:w="1350"/>
             <w:tcBorders>
               <w:top w:val="none" w:color="auto" w:sz="0"/>
               <w:left w:val="none" w:color="auto" w:sz="0"/>
@@ -181,6 +181,84 @@
           </w:p>
         </w:tc>
       </w:tr>
+      <w:tr>
+        <w:tc>
+          <w:tcPr>
+            <w:tcW w:type="pct" w:w="1650"/>
+            <w:tcBorders>
+              <w:top w:val="none" w:color="auto" w:sz="0"/>
+              <w:left w:val="none" w:color="auto" w:sz="0"/>
+              <w:bottom w:val="none" w:color="auto" w:sz="0"/>
+              <w:right w:val="none" w:color="auto" w:sz="0"/>
+            </w:tcBorders>
+            <w:tcMar>
+              <w:top w:type="dxa" w:w="0"/>
+              <w:left w:type="dxa" w:w="0"/>
+              <w:bottom w:type="dxa" w:w="0"/>
+              <w:right w:type="dxa" w:w="0"/>
+            </w:tcMar>
+          </w:tcPr>
+          <w:p>
+            <w:pPr>
+              <w:spacing w:after="40"/>
+              <w:jc w:val="left"/>
+            </w:pPr>
+          </w:p>
+        </w:tc>
+        <w:tc>
+          <w:tcPr>
+            <w:tcW w:type="pct" w:w="1650"/>
+            <w:tcBorders>
+              <w:top w:val="none" w:color="auto" w:sz="0"/>
+              <w:left w:val="none" w:color="auto" w:sz="0"/>
+              <w:bottom w:val="none" w:color="auto" w:sz="0"/>
+              <w:right w:val="none" w:color="auto" w:sz="0"/>
+            </w:tcBorders>
+            <w:tcMar>
+              <w:top w:type="dxa" w:w="0"/>
+              <w:left w:type="dxa" w:w="0"/>
+              <w:bottom w:type="dxa" w:w="0"/>
+              <w:right w:type="dxa" w:w="0"/>
+            </w:tcMar>
+          </w:tcPr>
+          <w:p>
+            <w:pPr>
+              <w:spacing w:after="40"/>
+              <w:jc w:val="center"/>
+            </w:pPr>
+            <w:r>
+              <w:rPr>
+                <w:sz w:val="18"/>
+                <w:szCs w:val="18"/>
+              </w:rPr>
+              <w:t xml:space="preserve">جمهورية صوماليلاند</w:t>
+            </w:r>
+          </w:p>
+        </w:tc>
+        <w:tc>
+          <w:tcPr>
+            <w:tcW w:type="pct" w:w="1700"/>
+            <w:tcBorders>
+              <w:top w:val="none" w:color="auto" w:sz="0"/>
+              <w:left w:val="none" w:color="auto" w:sz="0"/>
+              <w:bottom w:val="none" w:color="auto" w:sz="0"/>
+              <w:right w:val="none" w:color="auto" w:sz="0"/>
+            </w:tcBorders>
+            <w:tcMar>
+              <w:top w:type="dxa" w:w="0"/>
+              <w:left w:type="dxa" w:w="0"/>
+              <w:bottom w:type="dxa" w:w="0"/>
+              <w:right w:type="dxa" w:w="0"/>
+            </w:tcMar>
+          </w:tcPr>
+          <w:p>
+            <w:pPr>
+              <w:spacing w:after="40"/>
+              <w:jc w:val="right"/>
+            </w:pPr>
+          </w:p>
+        </w:tc>
+      </w:tr>
     </w:tbl>
     <w:p>
       <w:pPr>
@@ -269,7 +347,7 @@
           <w:iCs/>
           <w:u w:val="single"/>
         </w:rPr>
-        <w:t xml:space="preserve">Salaasa</w:t>
+        <w:t xml:space="preserve">{{WEEKDAY}}</w:t>
       </w:r>
       <w:r>
         <w:tab/>
@@ -310,7 +388,7 @@
           <w:szCs w:val="32"/>
           <w:u w:val="single"/>
         </w:rPr>
-        <w:t xml:space="preserve">Cadayn Masuuliyad Qaadis Bukaan.</w:t>
+        <w:t xml:space="preserve">{{CINWAANKA_CADAYNTA}}</w:t>
       </w:r>
     </w:p>
     <w:p>

</xml_diff>